<commit_message>
v0.2.0: merge adjacent del+ins into replacements, heading-based locations, author/resolved filters, .docx response-table output
</commit_message>
<xml_diff>
--- a/examples/sample.docx
+++ b/examples/sample.docx
@@ -3,8 +3,11 @@
 <w:document xmlns:w="http://schemas.openxmlformats.org/wordprocessingml/2006/main" xmlns:w14="http://schemas.microsoft.com/office/word/2010/wordml" xmlns:w15="http://schemas.microsoft.com/office/word/2012/wordml">
   <w:body>
     <w:p>
+      <w:pPr>
+        <w:pStyle w:val="Heading1"/>
+      </w:pPr>
       <w:r>
-        <w:t>第3章 基于深度学习的图像识别方法</w:t>
+        <w:t>第3章 图像识别方法</w:t>
       </w:r>
     </w:p>
     <w:p>

</xml_diff>

<commit_message>
v0.3.3: footnote-number locations, hardened inputs, ruff lint gate, richer sample
</commit_message>
<xml_diff>
--- a/examples/sample.docx
+++ b/examples/sample.docx
@@ -23,7 +23,16 @@
         <w:commentReference w:id="1"/>
       </w:r>
       <w:r>
-        <w:t xml:space="preserve">，尤其是卷积神经网络在大规模数据集上的表现。</w:t>
+        <w:t xml:space="preserve">，尤其是卷积神经网络在大规模数据集上的表现</w:t>
+      </w:r>
+      <w:r>
+        <w:rPr>
+          <w:vertAlign w:val="superscript"/>
+        </w:rPr>
+        <w:footnoteReference w:id="2"/>
+      </w:r>
+      <w:r>
+        <w:t>。</w:t>
       </w:r>
     </w:p>
     <w:p>
@@ -41,7 +50,19 @@
         </w:r>
       </w:del>
       <w:r>
-        <w:t xml:space="preserve">优于基线方法。</w:t>
+        <w:t xml:space="preserve">优于基线方法，</w:t>
+      </w:r>
+      <w:r>
+        <w:rPr>
+          <w:b/>
+          <w:rPrChange w:id="12" w:author="王老师" w:date="2026-08-11T03:02:00Z">
+            <w:rPr/>
+          </w:rPrChange>
+        </w:rPr>
+        <w:t>在两个公开数据集上均达到最优</w:t>
+      </w:r>
+      <w:r>
+        <w:t>。</w:t>
       </w:r>
     </w:p>
     <w:p>
@@ -84,6 +105,13 @@
       </w:r>
     </w:p>
   </w:comment>
+  <w:comment w:id="3" w:author="王老师" w:date="2026-08-10T02:08:00Z" w:initials="W">
+    <w:p>
+      <w:r>
+        <w:t>参考文献格式请按 GB/T 7714 调整，补全卷期页码。</w:t>
+      </w:r>
+    </w:p>
+  </w:comment>
 </w:comments>
 </file>
 
@@ -92,5 +120,37 @@
   <w15:commentEx w15:paraId="C0000001" w15:done="0"/>
   <w15:commentEx w15:paraId="C0000002" w15:paraIdParent="C0000001" w15:done="0"/>
   <w15:commentEx w15:paraId="C0000003" w15:done="1"/>
+  <w15:commentEx w15:paraId="C0000004" w15:done="0"/>
 </w15:commentsEx>
+</file>
+
+<file path=word/footnotes.xml><?xml version="1.0" encoding="utf-8"?>
+<w:footnotes xmlns:w="http://schemas.openxmlformats.org/wordprocessingml/2006/main" xmlns:w14="http://schemas.microsoft.com/office/word/2010/wordml" xmlns:w15="http://schemas.microsoft.com/office/word/2012/wordml">
+  <w:footnote w:type="separator" w:id="-1">
+    <w:p>
+      <w:r>
+        <w:separator/>
+      </w:r>
+    </w:p>
+  </w:footnote>
+  <w:footnote w:type="continuationSeparator" w:id="0">
+    <w:p>
+      <w:r>
+        <w:continuationSeparator/>
+      </w:r>
+    </w:p>
+  </w:footnote>
+  <w:footnote w:id="2">
+    <w:p>
+      <w:commentRangeStart w:id="3"/>
+      <w:r>
+        <w:t>LeCun Y, Bengio Y, Hinton G. Deep learning. Nature, 2015.</w:t>
+      </w:r>
+      <w:commentRangeEnd w:id="3"/>
+      <w:r>
+        <w:commentReference w:id="3"/>
+      </w:r>
+    </w:p>
+  </w:footnote>
+</w:footnotes>
 </file>
</xml_diff>